<commit_message>
Guides: sign in by email address, and the limits of that boundary
Co-Authored-By: Claude Opus 4.8 <noreply@anthropic.com>
</commit_message>
<xml_diff>
--- a/Composite Lodge 4076 - Secretary Guide.docx
+++ b/Composite Lodge 4076 - Secretary Guide.docx
@@ -109,6 +109,24 @@
           <w:i w:val="0"/>
         </w:rPr>
         <w:t>Your own entry in the Members list must carry your email address (rlakhani1@outlook.com). That entry is what unlocks the Secretary-only controls — the Permissions card in Settings, sight of every committee chat, and committee editing. Until an entry with that email exists, the app stays in a “setup phase” where anyone can edit committees, so make your own member record your first job.</w:t>
+      </w:r>
+    </w:p>
+    <w:p>
+      <w:pPr/>
+      <w:r>
+        <w:t>Brethren identify themselves by the email address held against their record — not by picking a name from a list. This matters: the lodge passcode is shared by everyone, so if names could simply be chosen, any brother could sign in as you and take the Secretary’s sight of the subscriptions ledger and the private committee chats.</w:t>
+      </w:r>
+    </w:p>
+    <w:p>
+      <w:pPr/>
+      <w:r>
+        <w:t>So keep email addresses on the records. A brother whose record carries no address can still sign in by choosing his name, but he gets no office and no permissions until you add it. Records that do carry an address never appear in that list at all.</w:t>
+      </w:r>
+    </w:p>
+    <w:p>
+      <w:pPr/>
+      <w:r>
+        <w:t>Be aware of the limit of this. It is a boundary in the interface, not a lock: every signed-in device holds the same key to the shared data file, so a determined and technically-minded brother could still read what is in it. Treat the ledger as private by courtesy rather than secret, and keep anything truly sensitive out of the app.</w:t>
       </w:r>
     </w:p>
     <w:p>

</xml_diff>

<commit_message>
Documents on each meeting — the summons, the table plan and the rest
A Documents section on every meeting page. Every member can open what is
there; adding and removing is limited to the Secretary and the brethren he has
permitted, checked in the handlers and not only hidden in the markup.

Files go to the private data repository alongside notice attachments, under a
path built from the meeting id with the slash and bar sanitised out. Several
can be chosen at once, up to 5 MB each, read through FileReader so a few
megabytes do not go through a character-at-a-time string build. Removing one
deletes the blob as well as the record, best effort.

Records merge by id like everything else, so two devices adding different
papers keep both, and a removal beats an older copy. New documents raise an
in-app notification for everyone but whoever added them, are searchable by
filename, and flag the sync commit.

Co-Authored-By: Claude Opus 4.8 <noreply@anthropic.com>
</commit_message>
<xml_diff>
--- a/Composite Lodge 4076 - Secretary Guide.docx
+++ b/Composite Lodge 4076 - Secretary Guide.docx
@@ -259,6 +259,38 @@
       <w:pPr/>
       <w:r>
         <w:t>Set the date, time and place on each meeting page. Those feed the meeting cards and the 📅 Add to my calendar button, which produces a calendar file that works on any phone or computer — no lodge Google account needed.</w:t>
+      </w:r>
+    </w:p>
+    <w:p>
+      <w:pPr>
+        <w:pStyle w:val="Heading1"/>
+      </w:pPr>
+      <w:r>
+        <w:t>Meeting documents</w:t>
+      </w:r>
+    </w:p>
+    <w:p>
+      <w:pPr/>
+      <w:r>
+        <w:t>The Documents section on each meeting page is where the summons, the table plan and any other papers live. Choose one or several files at once and press Add document. PDF, Word and images all work, up to 5 MB each.</w:t>
+      </w:r>
+    </w:p>
+    <w:p>
+      <w:pPr/>
+      <w:r>
+        <w:t>Every member can open them; only you and the brethren you have permitted in Settings → Permissions can add or remove. Removing one deletes the file itself, not just the entry.</w:t>
+      </w:r>
+    </w:p>
+    <w:p>
+      <w:pPr/>
+      <w:r>
+        <w:t>The brethren get a notification when a document appears, so putting the summons up is enough — there is no need to send it round separately.</w:t>
+      </w:r>
+    </w:p>
+    <w:p>
+      <w:pPr/>
+      <w:r>
+        <w:t>The files are held in the lodge’s private data repository alongside everything else the app stores, so they come down to each device on sync. Keep them modest in size: they are fetched over the members’ mobile data.</w:t>
       </w:r>
     </w:p>
     <w:p>

</xml_diff>